<commit_message>
Recheck 5 cable/machine exercise pages and add developer file with audit
Co-Authored-By: Claude Opus 5.5 <noreply@anthropic.com>
Claude-Session: https://claude.ai/code/session_017hiaZm1T4szyzJ4v1JU3Uk
</commit_message>
<xml_diff>
--- a/exercisemenu-batch2/out/01-cable-kneeling-crunch.docx
+++ b/exercisemenu-batch2/out/01-cable-kneeling-crunch.docx
@@ -1542,7 +1542,7 @@
           </w:tcPr>
           <w:p>
             <w:r>
-              <w:t>Breathe Out as You Curl: Exhaling fully at the bottom of each rep makes it easier to round your spine further.</w:t>
+              <w:t>Breathe Out as You Curl: Exhale as you curl down and breathe in as you uncurl, so you don't hold your breath through the set.</w:t>
             </w:r>
           </w:p>
         </w:tc>
@@ -2149,7 +2149,7 @@
           </w:tcPr>
           <w:p>
             <w:r>
-              <w:t>Usually because the hips are moving. Keep your hips still over your knees and lighten the weight until the movement comes from your spine.</w:t>
+              <w:t>Most often the hips are moving. Keep your hips still over your knees and lighten the weight until the movement comes from your spine.</w:t>
             </w:r>
           </w:p>
         </w:tc>
@@ -2253,7 +2253,7 @@
           </w:tcPr>
           <w:p>
             <w:r>
-              <w:t>Two or three sessions a week is enough for most people, especially if you also do heavy compound lifts.</w:t>
+              <w:t>The workout plans on this site use 2–3 sets once or twice a week. Add more only if your abs recover well between sessions.</w:t>
             </w:r>
           </w:p>
         </w:tc>

</xml_diff>